<commit_message>
save before merging with autodl
</commit_message>
<xml_diff>
--- a/experiments/OWT_experiement.docx
+++ b/experiments/OWT_experiement.docx
@@ -42,11 +42,7 @@
     </w:p>
     <w:p>
       <w:pPr>
-        <w:pStyle w:val="a9"/>
-        <w:numPr>
-          <w:ilvl w:val="0"/>
-          <w:numId w:val="1"/>
-        </w:numPr>
+        <w:pStyle w:val="2"/>
         <w:rPr>
           <w:rFonts w:hint="eastAsia"/>
         </w:rPr>
@@ -142,7 +138,21 @@
         <w:rPr>
           <w:rFonts w:hint="eastAsia"/>
         </w:rPr>
-        <w:t>theoretical FLOPs：理论计算得到模型计算量。基于tune模型超参数来提高模型performance的实验目的，并采用scaling law的方法，</w:t>
+        <w:t>theoretical FLOPs：理论计算得到模型计算量。基于tune</w:t>
+      </w:r>
+      <w:proofErr w:type="gramStart"/>
+      <w:r>
+        <w:rPr>
+          <w:rFonts w:hint="eastAsia"/>
+        </w:rPr>
+        <w:t>模型超</w:t>
+      </w:r>
+      <w:proofErr w:type="gramEnd"/>
+      <w:r>
+        <w:rPr>
+          <w:rFonts w:hint="eastAsia"/>
+        </w:rPr>
+        <w:t>参数来提高模型performance的实验目的，并采用scaling law的方法，</w:t>
       </w:r>
       <w:r>
         <w:rPr>
@@ -327,20 +337,13 @@
           <w:rFonts w:hint="eastAsia"/>
           <w:u w:val="single"/>
         </w:rPr>
-        <w:t>FLOPs为</w:t>
+        <w:t>FLOPs为1.626e+18</w:t>
       </w:r>
       <w:r>
         <w:rPr>
           <w:rFonts w:hint="eastAsia"/>
           <w:u w:val="single"/>
         </w:rPr>
-        <w:t>1.626e+18</w:t>
-      </w:r>
-      <w:r>
-        <w:rPr>
-          <w:rFonts w:hint="eastAsia"/>
-          <w:u w:val="single"/>
-        </w:rPr>
         <w:t>。</w:t>
       </w:r>
     </w:p>
@@ -353,11 +356,7 @@
     </w:p>
     <w:p>
       <w:pPr>
-        <w:pStyle w:val="a9"/>
-        <w:numPr>
-          <w:ilvl w:val="0"/>
-          <w:numId w:val="1"/>
-        </w:numPr>
+        <w:pStyle w:val="2"/>
         <w:rPr>
           <w:rFonts w:hint="eastAsia"/>
         </w:rPr>
@@ -991,15 +990,22 @@
         <w:rPr>
           <w:rFonts w:hint="eastAsia"/>
         </w:rPr>
-        <w:lastRenderedPageBreak/>
         <w:t>num</w:t>
       </w:r>
       <w:r>
-        <w:t>_heads</w:t>
-      </w:r>
-      <w:proofErr w:type="spellEnd"/>
-      <w:r>
-        <w:t>: {12, 16, 20}</w:t>
+        <w:t>_</w:t>
+      </w:r>
+      <w:proofErr w:type="gramStart"/>
+      <w:r>
+        <w:t>heads</w:t>
+      </w:r>
+      <w:proofErr w:type="spellEnd"/>
+      <w:r>
+        <w:t>: {</w:t>
+      </w:r>
+      <w:proofErr w:type="gramEnd"/>
+      <w:r>
+        <w:t>12, 16, 20}</w:t>
       </w:r>
     </w:p>
     <w:p>
@@ -1075,11 +1081,27 @@
       </w:pPr>
       <w:proofErr w:type="spellStart"/>
       <w:r>
-        <w:t>num_layers</w:t>
-      </w:r>
-      <w:proofErr w:type="spellEnd"/>
-      <w:r>
-        <w:t> : {8, 12} -&gt; model width/ h</w:t>
+        <w:t>num_</w:t>
+      </w:r>
+      <w:proofErr w:type="gramStart"/>
+      <w:r>
+        <w:t>layers</w:t>
+      </w:r>
+      <w:proofErr w:type="spellEnd"/>
+      <w:r>
+        <w:t> :</w:t>
+      </w:r>
+      <w:proofErr w:type="gramEnd"/>
+      <w:r>
+        <w:t xml:space="preserve"> {8, </w:t>
+      </w:r>
+      <w:proofErr w:type="gramStart"/>
+      <w:r>
+        <w:t>12} -</w:t>
+      </w:r>
+      <w:proofErr w:type="gramEnd"/>
+      <w:r>
+        <w:t>&gt; model width/ h</w:t>
       </w:r>
       <w:r>
         <w:t xml:space="preserve">eight ratio: </w:t>
@@ -1350,7 +1372,15 @@
         <w:t>C</w:t>
       </w:r>
       <w:r>
-        <w:t>ontext length: {512, 1024}</w:t>
+        <w:t xml:space="preserve">ontext </w:t>
+      </w:r>
+      <w:proofErr w:type="gramStart"/>
+      <w:r>
+        <w:t>length: {</w:t>
+      </w:r>
+      <w:proofErr w:type="gramEnd"/>
+      <w:r>
+        <w:t>512, 1024}</w:t>
       </w:r>
     </w:p>
     <w:p>
@@ -1417,23 +1447,27 @@
         </w:rPr>
       </w:pPr>
       <w:r>
-        <w:t>(Calculated by the compute budget and number of model parameters)</w:t>
-      </w:r>
-    </w:p>
-    <w:p>
-      <w:pPr>
-        <w:rPr>
-          <w:rFonts w:hint="eastAsia"/>
-        </w:rPr>
-      </w:pPr>
-    </w:p>
-    <w:p>
-      <w:pPr>
-        <w:pStyle w:val="a9"/>
-        <w:numPr>
-          <w:ilvl w:val="0"/>
-          <w:numId w:val="1"/>
-        </w:numPr>
+        <w:t xml:space="preserve">(Calculated by the </w:t>
+      </w:r>
+      <w:proofErr w:type="gramStart"/>
+      <w:r>
+        <w:t>compute</w:t>
+      </w:r>
+      <w:proofErr w:type="gramEnd"/>
+      <w:r>
+        <w:t xml:space="preserve"> budget and number of model parameters)</w:t>
+      </w:r>
+    </w:p>
+    <w:p>
+      <w:pPr>
+        <w:rPr>
+          <w:rFonts w:hint="eastAsia"/>
+        </w:rPr>
+      </w:pPr>
+    </w:p>
+    <w:p>
+      <w:pPr>
+        <w:pStyle w:val="2"/>
         <w:rPr>
           <w:rFonts w:hint="eastAsia"/>
         </w:rPr>
@@ -1468,7 +1502,31 @@
         <w:rPr>
           <w:rFonts w:hint="eastAsia"/>
         </w:rPr>
-        <w:t>model size，context length</w:t>
+        <w:t>model size</w:t>
+      </w:r>
+      <w:r>
+        <w:rPr>
+          <w:rFonts w:hint="eastAsia"/>
+        </w:rPr>
+        <w:t>，</w:t>
+      </w:r>
+      <w:r>
+        <w:rPr>
+          <w:rFonts w:hint="eastAsia"/>
+        </w:rPr>
+        <w:t>并且</w:t>
+      </w:r>
+      <w:r>
+        <w:rPr>
+          <w:rFonts w:hint="eastAsia"/>
+        </w:rPr>
+        <w:t>提高</w:t>
+      </w:r>
+      <w:r>
+        <w:rPr>
+          <w:rFonts w:hint="eastAsia"/>
+        </w:rPr>
+        <w:t>context length</w:t>
       </w:r>
       <w:r>
         <w:rPr>
@@ -1503,55 +1561,6 @@
           <w:rFonts w:hint="eastAsia"/>
         </w:rPr>
         <w:t>）</w:t>
-      </w:r>
-    </w:p>
-    <w:p>
-      <w:pPr>
-        <w:pStyle w:val="a9"/>
-        <w:ind w:left="432"/>
-      </w:pPr>
-      <w:hyperlink r:id="rId7" w:history="1">
-        <w:r>
-          <w:rPr>
-            <w:rStyle w:val="af3"/>
-            <w:rFonts w:ascii="Segoe UI" w:hAnsi="Segoe UI" w:cs="Segoe UI"/>
-            <w:color w:val="0969DA"/>
-            <w:shd w:val="clear" w:color="auto" w:fill="FFFFFF"/>
-          </w:rPr>
-          <w:t>MobileL</w:t>
-        </w:r>
-        <w:r>
-          <w:rPr>
-            <w:rStyle w:val="af3"/>
-            <w:rFonts w:ascii="Segoe UI" w:hAnsi="Segoe UI" w:cs="Segoe UI"/>
-            <w:color w:val="0969DA"/>
-            <w:shd w:val="clear" w:color="auto" w:fill="FFFFFF"/>
-          </w:rPr>
-          <w:t>L</w:t>
-        </w:r>
-        <w:r>
-          <w:rPr>
-            <w:rStyle w:val="af3"/>
-            <w:rFonts w:ascii="Segoe UI" w:hAnsi="Segoe UI" w:cs="Segoe UI"/>
-            <w:color w:val="0969DA"/>
-            <w:shd w:val="clear" w:color="auto" w:fill="FFFFFF"/>
-          </w:rPr>
-          <w:t>M</w:t>
-        </w:r>
-      </w:hyperlink>
-      <w:r>
-        <w:rPr>
-          <w:rFonts w:ascii="Segoe UI" w:hAnsi="Segoe UI" w:cs="Segoe UI"/>
-          <w:color w:val="1F2328"/>
-          <w:shd w:val="clear" w:color="auto" w:fill="FFFFFF"/>
-        </w:rPr>
-        <w:t> </w:t>
-      </w:r>
-      <w:r>
-        <w:rPr>
-          <w:rFonts w:hint="eastAsia"/>
-        </w:rPr>
-        <w:t>指出，对于参数量比较小的model，深度比宽度更重要。</w:t>
       </w:r>
     </w:p>
     <w:p>
@@ -1578,6 +1587,35 @@
         </w:numPr>
       </w:pPr>
       <w:r>
+        <w:rPr>
+          <w:rFonts w:hint="eastAsia"/>
+        </w:rPr>
+        <w:t>思路：提高model size，参考</w:t>
+      </w:r>
+      <w:proofErr w:type="spellStart"/>
+      <w:r>
+        <w:rPr>
+          <w:rFonts w:hint="eastAsia"/>
+        </w:rPr>
+        <w:t>minimind</w:t>
+      </w:r>
+      <w:proofErr w:type="spellEnd"/>
+      <w:r>
+        <w:rPr>
+          <w:rFonts w:hint="eastAsia"/>
+        </w:rPr>
+        <w:t>的小模型架构参数</w:t>
+      </w:r>
+    </w:p>
+    <w:p>
+      <w:pPr>
+        <w:pStyle w:val="a9"/>
+        <w:ind w:left="792"/>
+        <w:rPr>
+          <w:rFonts w:hint="eastAsia"/>
+        </w:rPr>
+      </w:pPr>
+      <w:r>
         <w:t>M</w:t>
       </w:r>
       <w:r>
@@ -1602,12 +1640,781 @@
         <w:rPr>
           <w:rFonts w:hint="eastAsia"/>
         </w:rPr>
-        <w:t>96 (参考</w:t>
-      </w:r>
-      <w:proofErr w:type="spellStart"/>
-      <w:r>
-        <w:rPr>
-          <w:rFonts w:hint="eastAsia"/>
+        <w:t xml:space="preserve">96 </w:t>
+      </w:r>
+    </w:p>
+    <w:p>
+      <w:pPr>
+        <w:pStyle w:val="a9"/>
+        <w:ind w:left="792"/>
+        <w:rPr>
+          <w:rFonts w:hint="eastAsia"/>
+        </w:rPr>
+      </w:pPr>
+      <w:proofErr w:type="spellStart"/>
+      <w:r>
+        <w:rPr>
+          <w:rFonts w:hint="eastAsia"/>
+        </w:rPr>
+        <w:t>d_model</w:t>
+      </w:r>
+      <w:proofErr w:type="spellEnd"/>
+      <w:r>
+        <w:rPr>
+          <w:rFonts w:hint="eastAsia"/>
+        </w:rPr>
+        <w:t xml:space="preserve">: 768, </w:t>
+      </w:r>
+      <w:proofErr w:type="spellStart"/>
+      <w:r>
+        <w:rPr>
+          <w:rFonts w:hint="eastAsia"/>
+        </w:rPr>
+        <w:t>d_ff</w:t>
+      </w:r>
+      <w:proofErr w:type="spellEnd"/>
+      <w:r>
+        <w:rPr>
+          <w:rFonts w:hint="eastAsia"/>
+        </w:rPr>
+        <w:t xml:space="preserve">: 2048, </w:t>
+      </w:r>
+      <w:proofErr w:type="spellStart"/>
+      <w:r>
+        <w:rPr>
+          <w:rFonts w:hint="eastAsia"/>
+        </w:rPr>
+        <w:t>num_layers</w:t>
+      </w:r>
+      <w:proofErr w:type="spellEnd"/>
+      <w:r>
+        <w:rPr>
+          <w:rFonts w:hint="eastAsia"/>
+        </w:rPr>
+        <w:t>: 8</w:t>
+      </w:r>
+      <w:r>
+        <w:rPr>
+          <w:rFonts w:hint="eastAsia"/>
+        </w:rPr>
+        <w:t xml:space="preserve">, </w:t>
+      </w:r>
+      <w:proofErr w:type="spellStart"/>
+      <w:r>
+        <w:rPr>
+          <w:rFonts w:hint="eastAsia"/>
+        </w:rPr>
+        <w:t>num_heads</w:t>
+      </w:r>
+      <w:proofErr w:type="spellEnd"/>
+      <w:r>
+        <w:rPr>
+          <w:rFonts w:hint="eastAsia"/>
+        </w:rPr>
+        <w:t xml:space="preserve">: </w:t>
+      </w:r>
+      <w:r>
+        <w:rPr>
+          <w:rFonts w:hint="eastAsia"/>
+        </w:rPr>
+        <w:t>16</w:t>
+      </w:r>
+      <w:r>
+        <w:rPr>
+          <w:rFonts w:hint="eastAsia"/>
+        </w:rPr>
+        <w:t xml:space="preserve">, </w:t>
+      </w:r>
+      <w:proofErr w:type="spellStart"/>
+      <w:r>
+        <w:rPr>
+          <w:rFonts w:hint="eastAsia"/>
+        </w:rPr>
+        <w:t>max_lr</w:t>
+      </w:r>
+      <w:proofErr w:type="spellEnd"/>
+      <w:r>
+        <w:rPr>
+          <w:rFonts w:hint="eastAsia"/>
+        </w:rPr>
+        <w:t xml:space="preserve">: 5e-4, </w:t>
+      </w:r>
+      <w:proofErr w:type="spellStart"/>
+      <w:r>
+        <w:rPr>
+          <w:rFonts w:hint="eastAsia"/>
+        </w:rPr>
+        <w:t>batch_size</w:t>
+      </w:r>
+      <w:proofErr w:type="spellEnd"/>
+      <w:r>
+        <w:rPr>
+          <w:rFonts w:hint="eastAsia"/>
+        </w:rPr>
+        <w:t>: 64</w:t>
+      </w:r>
+      <w:r>
+        <w:rPr>
+          <w:rFonts w:hint="eastAsia"/>
+        </w:rPr>
+        <w:t>, （</w:t>
+      </w:r>
+      <w:r>
+        <w:rPr>
+          <w:rFonts w:hint="eastAsia"/>
+        </w:rPr>
+        <w:t>no grad clipping</w:t>
+      </w:r>
+      <w:r>
+        <w:rPr>
+          <w:rFonts w:hint="eastAsia"/>
+        </w:rPr>
+        <w:t>）</w:t>
+      </w:r>
+    </w:p>
+    <w:p>
+      <w:pPr>
+        <w:pStyle w:val="a9"/>
+        <w:ind w:left="792"/>
+      </w:pPr>
+    </w:p>
+    <w:p>
+      <w:pPr>
+        <w:pStyle w:val="a9"/>
+        <w:ind w:left="792"/>
+        <w:rPr>
+          <w:u w:val="single"/>
+        </w:rPr>
+      </w:pPr>
+      <w:r>
+        <w:rPr>
+          <w:rFonts w:hint="eastAsia"/>
+          <w:u w:val="single"/>
+        </w:rPr>
+        <w:t>结果</w:t>
+      </w:r>
+      <w:r>
+        <w:rPr>
+          <w:rFonts w:hint="eastAsia"/>
+          <w:u w:val="single"/>
+        </w:rPr>
+        <w:t>:</w:t>
+      </w:r>
+    </w:p>
+    <w:p>
+      <w:pPr>
+        <w:pStyle w:val="a9"/>
+        <w:ind w:left="792"/>
+      </w:pPr>
+      <w:r>
+        <w:rPr>
+          <w:rFonts w:hint="eastAsia"/>
+        </w:rPr>
+        <w:t>Train steps</w:t>
+      </w:r>
+      <w:r>
+        <w:t> </w:t>
+      </w:r>
+      <w:r>
+        <w:rPr>
+          <w:rFonts w:hint="eastAsia"/>
+        </w:rPr>
+        <w:t>:14075</w:t>
+      </w:r>
+    </w:p>
+    <w:p>
+      <w:pPr>
+        <w:pStyle w:val="a9"/>
+        <w:ind w:left="792"/>
+        <w:rPr>
+          <w:rFonts w:hint="eastAsia"/>
+        </w:rPr>
+      </w:pPr>
+      <w:proofErr w:type="spellStart"/>
+      <w:r>
+        <w:rPr>
+          <w:rFonts w:hint="eastAsia"/>
+        </w:rPr>
+        <w:t>lr</w:t>
+      </w:r>
+      <w:proofErr w:type="spellEnd"/>
+      <w:r>
+        <w:rPr>
+          <w:rFonts w:hint="eastAsia"/>
+        </w:rPr>
+        <w:t>: first linear increase to 5e-4 at step≈8300，then cos decay to 4.90e-4 at step 14075</w:t>
+      </w:r>
+    </w:p>
+    <w:p>
+      <w:pPr>
+        <w:pStyle w:val="a9"/>
+        <w:ind w:left="792"/>
+      </w:pPr>
+      <w:r>
+        <w:rPr>
+          <w:rFonts w:hint="eastAsia"/>
+          <w:u w:val="single"/>
+        </w:rPr>
+        <w:t>Final train loss：</w:t>
+      </w:r>
+      <w:r>
+        <w:rPr>
+          <w:rFonts w:hint="eastAsia"/>
+        </w:rPr>
+        <w:t>3</w:t>
+      </w:r>
+      <w:r>
+        <w:rPr>
+          <w:rFonts w:hint="eastAsia"/>
+        </w:rPr>
+        <w:t>.90</w:t>
+      </w:r>
+    </w:p>
+    <w:p>
+      <w:pPr>
+        <w:pStyle w:val="a9"/>
+        <w:ind w:left="792"/>
+        <w:rPr>
+          <w:rFonts w:hint="eastAsia"/>
+        </w:rPr>
+      </w:pPr>
+      <w:r>
+        <w:rPr>
+          <w:rFonts w:hint="eastAsia"/>
+          <w:u w:val="single"/>
+        </w:rPr>
+        <w:t>Final validation loss/ perplexity:</w:t>
+      </w:r>
+      <w:r>
+        <w:rPr>
+          <w:rFonts w:hint="eastAsia"/>
+        </w:rPr>
+        <w:t xml:space="preserve"> 3.97/ 53.13</w:t>
+      </w:r>
+    </w:p>
+    <w:p>
+      <w:pPr>
+        <w:pStyle w:val="a9"/>
+        <w:ind w:left="792"/>
+        <w:rPr>
+          <w:rFonts w:hint="eastAsia"/>
+        </w:rPr>
+      </w:pPr>
+      <w:r>
+        <w:lastRenderedPageBreak/>
+        <w:drawing>
+          <wp:inline distT="0" distB="0" distL="0" distR="0" wp14:anchorId="0C78366A" wp14:editId="70CF555F">
+            <wp:extent cx="2205859" cy="1740354"/>
+            <wp:effectExtent l="0" t="0" r="4445" b="0"/>
+            <wp:docPr id="634115012" name="图片 1"/>
+            <wp:cNvGraphicFramePr>
+              <a:graphicFrameLocks xmlns:a="http://schemas.openxmlformats.org/drawingml/2006/main" noChangeAspect="1"/>
+            </wp:cNvGraphicFramePr>
+            <a:graphic xmlns:a="http://schemas.openxmlformats.org/drawingml/2006/main">
+              <a:graphicData uri="http://schemas.openxmlformats.org/drawingml/2006/picture">
+                <pic:pic xmlns:pic="http://schemas.openxmlformats.org/drawingml/2006/picture">
+                  <pic:nvPicPr>
+                    <pic:cNvPr id="634115012" name=""/>
+                    <pic:cNvPicPr/>
+                  </pic:nvPicPr>
+                  <pic:blipFill>
+                    <a:blip r:embed="rId7"/>
+                    <a:stretch>
+                      <a:fillRect/>
+                    </a:stretch>
+                  </pic:blipFill>
+                  <pic:spPr>
+                    <a:xfrm>
+                      <a:off x="0" y="0"/>
+                      <a:ext cx="2205859" cy="1740354"/>
+                    </a:xfrm>
+                    <a:prstGeom prst="rect">
+                      <a:avLst/>
+                    </a:prstGeom>
+                  </pic:spPr>
+                </pic:pic>
+              </a:graphicData>
+            </a:graphic>
+          </wp:inline>
+        </w:drawing>
+      </w:r>
+      <w:r>
+        <w:rPr>
+          <w:rFonts w:hint="eastAsia"/>
+        </w:rPr>
+        <w:t xml:space="preserve">    </w:t>
+      </w:r>
+      <w:r>
+        <w:drawing>
+          <wp:inline distT="0" distB="0" distL="0" distR="0" wp14:anchorId="2BEFD8D3" wp14:editId="038A1120">
+            <wp:extent cx="2245805" cy="1883229"/>
+            <wp:effectExtent l="0" t="0" r="2540" b="3175"/>
+            <wp:docPr id="457636624" name="图片 1"/>
+            <wp:cNvGraphicFramePr>
+              <a:graphicFrameLocks xmlns:a="http://schemas.openxmlformats.org/drawingml/2006/main" noChangeAspect="1"/>
+            </wp:cNvGraphicFramePr>
+            <a:graphic xmlns:a="http://schemas.openxmlformats.org/drawingml/2006/main">
+              <a:graphicData uri="http://schemas.openxmlformats.org/drawingml/2006/picture">
+                <pic:pic xmlns:pic="http://schemas.openxmlformats.org/drawingml/2006/picture">
+                  <pic:nvPicPr>
+                    <pic:cNvPr id="457636624" name=""/>
+                    <pic:cNvPicPr/>
+                  </pic:nvPicPr>
+                  <pic:blipFill>
+                    <a:blip r:embed="rId8"/>
+                    <a:stretch>
+                      <a:fillRect/>
+                    </a:stretch>
+                  </pic:blipFill>
+                  <pic:spPr>
+                    <a:xfrm>
+                      <a:off x="0" y="0"/>
+                      <a:ext cx="2245805" cy="1883229"/>
+                    </a:xfrm>
+                    <a:prstGeom prst="rect">
+                      <a:avLst/>
+                    </a:prstGeom>
+                  </pic:spPr>
+                </pic:pic>
+              </a:graphicData>
+            </a:graphic>
+          </wp:inline>
+        </w:drawing>
+      </w:r>
+    </w:p>
+    <w:p>
+      <w:pPr>
+        <w:pStyle w:val="a9"/>
+        <w:numPr>
+          <w:ilvl w:val="0"/>
+          <w:numId w:val="9"/>
+        </w:numPr>
+      </w:pPr>
+      <w:r>
+        <w:rPr>
+          <w:rFonts w:hint="eastAsia"/>
+        </w:rPr>
+        <w:t>思路</w:t>
+      </w:r>
+      <w:r>
+        <w:rPr>
+          <w:rFonts w:hint="eastAsia"/>
+        </w:rPr>
+        <w:t>：</w:t>
+      </w:r>
+      <w:r>
+        <w:rPr>
+          <w:rFonts w:hint="eastAsia"/>
+        </w:rPr>
+        <w:t>降低模型</w:t>
+      </w:r>
+      <w:r>
+        <w:rPr>
+          <w:rFonts w:hint="eastAsia"/>
+        </w:rPr>
+        <w:t>width/dep</w:t>
+      </w:r>
+      <w:r>
+        <w:rPr>
+          <w:rFonts w:hint="eastAsia"/>
+        </w:rPr>
+        <w:t>th ratio，让模型结构更“细长”。</w:t>
+      </w:r>
+      <w:proofErr w:type="spellStart"/>
+      <w:r>
+        <w:rPr>
+          <w:rFonts w:hint="eastAsia"/>
+        </w:rPr>
+        <w:t>MobileLLM</w:t>
+      </w:r>
+      <w:proofErr w:type="spellEnd"/>
+      <w:r>
+        <w:rPr>
+          <w:rFonts w:hint="eastAsia"/>
+        </w:rPr>
+        <w:t xml:space="preserve"> 指出，对于参数量比较小的model，深度比宽度更重要。</w:t>
+      </w:r>
+    </w:p>
+    <w:p>
+      <w:pPr>
+        <w:pStyle w:val="a9"/>
+        <w:ind w:left="792"/>
+        <w:rPr>
+          <w:rFonts w:hint="eastAsia"/>
+        </w:rPr>
+      </w:pPr>
+      <w:r>
+        <w:t>M</w:t>
+      </w:r>
+      <w:r>
+        <w:rPr>
+          <w:rFonts w:hint="eastAsia"/>
+        </w:rPr>
+        <w:t xml:space="preserve">odel width/ </w:t>
+      </w:r>
+      <w:r>
+        <w:rPr>
+          <w:rFonts w:hint="eastAsia"/>
+        </w:rPr>
+        <w:t>depth</w:t>
+      </w:r>
+      <w:r>
+        <w:rPr>
+          <w:rFonts w:hint="eastAsia"/>
+        </w:rPr>
+        <w:t xml:space="preserve">: </w:t>
+      </w:r>
+      <w:r>
+        <w:rPr>
+          <w:rFonts w:hint="eastAsia"/>
+        </w:rPr>
+        <w:t>64</w:t>
+      </w:r>
+      <w:r>
+        <w:rPr>
+          <w:rFonts w:hint="eastAsia"/>
+        </w:rPr>
+        <w:t xml:space="preserve"> (</w:t>
+      </w:r>
+      <w:r>
+        <w:rPr>
+          <w:rFonts w:hint="eastAsia"/>
+        </w:rPr>
+        <w:t>GPT2-small/ leaderboard no.1配置</w:t>
+      </w:r>
+      <w:r>
+        <w:rPr>
+          <w:rFonts w:hint="eastAsia"/>
+        </w:rPr>
+        <w:t>)</w:t>
+      </w:r>
+    </w:p>
+    <w:p>
+      <w:pPr>
+        <w:pStyle w:val="a9"/>
+        <w:ind w:left="792"/>
+      </w:pPr>
+      <w:proofErr w:type="spellStart"/>
+      <w:r>
+        <w:rPr>
+          <w:rFonts w:hint="eastAsia"/>
+        </w:rPr>
+        <w:t>d_model</w:t>
+      </w:r>
+      <w:proofErr w:type="spellEnd"/>
+      <w:r>
+        <w:rPr>
+          <w:rFonts w:hint="eastAsia"/>
+        </w:rPr>
+        <w:t xml:space="preserve">: 768, </w:t>
+      </w:r>
+      <w:proofErr w:type="spellStart"/>
+      <w:r>
+        <w:rPr>
+          <w:rFonts w:hint="eastAsia"/>
+        </w:rPr>
+        <w:t>d_ff</w:t>
+      </w:r>
+      <w:proofErr w:type="spellEnd"/>
+      <w:r>
+        <w:rPr>
+          <w:rFonts w:hint="eastAsia"/>
+        </w:rPr>
+        <w:t xml:space="preserve">: 2048, </w:t>
+      </w:r>
+      <w:proofErr w:type="spellStart"/>
+      <w:r>
+        <w:rPr>
+          <w:rFonts w:hint="eastAsia"/>
+        </w:rPr>
+        <w:t>num_layers</w:t>
+      </w:r>
+      <w:proofErr w:type="spellEnd"/>
+      <w:r>
+        <w:rPr>
+          <w:rFonts w:hint="eastAsia"/>
+        </w:rPr>
+        <w:t xml:space="preserve">: </w:t>
+      </w:r>
+      <w:r>
+        <w:rPr>
+          <w:rFonts w:hint="eastAsia"/>
+        </w:rPr>
+        <w:t>12</w:t>
+      </w:r>
+      <w:r>
+        <w:rPr>
+          <w:rFonts w:hint="eastAsia"/>
+        </w:rPr>
+        <w:t xml:space="preserve">, </w:t>
+      </w:r>
+      <w:proofErr w:type="spellStart"/>
+      <w:r>
+        <w:rPr>
+          <w:rFonts w:hint="eastAsia"/>
+        </w:rPr>
+        <w:t>num_heads</w:t>
+      </w:r>
+      <w:proofErr w:type="spellEnd"/>
+      <w:r>
+        <w:rPr>
+          <w:rFonts w:hint="eastAsia"/>
+        </w:rPr>
+        <w:t>: 1</w:t>
+      </w:r>
+      <w:r>
+        <w:rPr>
+          <w:rFonts w:hint="eastAsia"/>
+        </w:rPr>
+        <w:t>2（GPT2-small配置）</w:t>
+      </w:r>
+      <w:r>
+        <w:rPr>
+          <w:rFonts w:hint="eastAsia"/>
+        </w:rPr>
+        <w:t>, max_</w:t>
+      </w:r>
+      <w:proofErr w:type="spellStart"/>
+      <w:r>
+        <w:rPr>
+          <w:rFonts w:hint="eastAsia"/>
+        </w:rPr>
+        <w:t>lr</w:t>
+      </w:r>
+      <w:proofErr w:type="spellEnd"/>
+      <w:r>
+        <w:rPr>
+          <w:rFonts w:hint="eastAsia"/>
+        </w:rPr>
+        <w:t xml:space="preserve">: 5e-4, </w:t>
+      </w:r>
+      <w:proofErr w:type="spellStart"/>
+      <w:r>
+        <w:rPr>
+          <w:rFonts w:hint="eastAsia"/>
+        </w:rPr>
+        <w:t>batch_size</w:t>
+      </w:r>
+      <w:proofErr w:type="spellEnd"/>
+      <w:r>
+        <w:rPr>
+          <w:rFonts w:hint="eastAsia"/>
+        </w:rPr>
+        <w:t>: 64, （</w:t>
+      </w:r>
+      <w:r>
+        <w:rPr>
+          <w:rFonts w:hint="eastAsia"/>
+        </w:rPr>
+        <w:t>with</w:t>
+      </w:r>
+      <w:r>
+        <w:rPr>
+          <w:rFonts w:hint="eastAsia"/>
+        </w:rPr>
+        <w:t xml:space="preserve"> grad clipping）</w:t>
+      </w:r>
+    </w:p>
+    <w:p>
+      <w:pPr>
+        <w:pStyle w:val="a9"/>
+        <w:numPr>
+          <w:ilvl w:val="0"/>
+          <w:numId w:val="2"/>
+        </w:numPr>
+        <w:rPr>
+          <w:rFonts w:hint="eastAsia"/>
+        </w:rPr>
+      </w:pPr>
+      <w:r>
+        <w:rPr>
+          <w:rFonts w:hint="eastAsia"/>
+        </w:rPr>
+        <w:t>思路：增加模型width-&gt; 增加模型</w:t>
+      </w:r>
+      <w:r>
+        <w:rPr>
+          <w:rFonts w:hint="eastAsia"/>
+        </w:rPr>
+        <w:t>宽深比 / 保持模型宽深比，从而使用一个很大size的模型，和增加模型宽深比的使用相同FLOPs（i.e. 减少训练steps），观察哪个更优</w:t>
+      </w:r>
+    </w:p>
+    <w:p/>
+    <w:p/>
+    <w:p/>
+    <w:p/>
+    <w:p/>
+    <w:p>
+      <w:pPr>
+        <w:rPr>
+          <w:i/>
+          <w:iCs/>
+        </w:rPr>
+      </w:pPr>
+      <w:r>
+        <w:rPr>
+          <w:rFonts w:hint="eastAsia"/>
+          <w:i/>
+          <w:iCs/>
+        </w:rPr>
+        <w:t>其他potential改动</w:t>
+      </w:r>
+      <w:r>
+        <w:rPr>
+          <w:rFonts w:hint="eastAsia"/>
+          <w:i/>
+          <w:iCs/>
+        </w:rPr>
+        <w:t>：</w:t>
+      </w:r>
+    </w:p>
+    <w:p>
+      <w:pPr>
+        <w:pStyle w:val="a9"/>
+        <w:numPr>
+          <w:ilvl w:val="0"/>
+          <w:numId w:val="10"/>
+        </w:numPr>
+        <w:rPr>
+          <w:i/>
+          <w:iCs/>
+        </w:rPr>
+      </w:pPr>
+      <w:r>
+        <w:rPr>
+          <w:rFonts w:hint="eastAsia"/>
+          <w:i/>
+          <w:iCs/>
+        </w:rPr>
+        <w:t>可以参考leaderboard NO.1</w:t>
+      </w:r>
+    </w:p>
+    <w:p>
+      <w:pPr>
+        <w:pStyle w:val="a9"/>
+        <w:numPr>
+          <w:ilvl w:val="0"/>
+          <w:numId w:val="10"/>
+        </w:numPr>
+        <w:rPr>
+          <w:i/>
+          <w:iCs/>
+        </w:rPr>
+      </w:pPr>
+      <w:r>
+        <w:rPr>
+          <w:rFonts w:hint="eastAsia"/>
+          <w:i/>
+          <w:iCs/>
+        </w:rPr>
+        <w:t>模型效率（MFU）</w:t>
+      </w:r>
+      <w:r>
+        <w:rPr>
+          <w:rFonts w:hint="eastAsia"/>
+          <w:i/>
+          <w:iCs/>
+        </w:rPr>
+        <w:t>（</w:t>
+      </w:r>
+      <w:r>
+        <w:rPr>
+          <w:rFonts w:hint="eastAsia"/>
+          <w:i/>
+          <w:iCs/>
+          <w:u w:val="single"/>
+        </w:rPr>
+        <w:t>可以参考目标/使用</w:t>
+      </w:r>
+      <w:proofErr w:type="spellStart"/>
+      <w:r>
+        <w:rPr>
+          <w:rFonts w:hint="eastAsia"/>
+          <w:i/>
+          <w:iCs/>
+          <w:u w:val="single"/>
+        </w:rPr>
+        <w:t>gpu</w:t>
+      </w:r>
+      <w:proofErr w:type="spellEnd"/>
+      <w:r>
+        <w:rPr>
+          <w:rFonts w:hint="eastAsia"/>
+          <w:i/>
+          <w:iCs/>
+          <w:u w:val="single"/>
+        </w:rPr>
+        <w:t xml:space="preserve"> FLOPS，使用对应比例时长作为实验budget</w:t>
+      </w:r>
+      <w:r>
+        <w:rPr>
+          <w:rFonts w:hint="eastAsia"/>
+          <w:i/>
+          <w:iCs/>
+        </w:rPr>
+        <w:t>）</w:t>
+      </w:r>
+      <w:r>
+        <w:rPr>
+          <w:rFonts w:hint="eastAsia"/>
+          <w:i/>
+          <w:iCs/>
+        </w:rPr>
+        <w:t>：GQA</w:t>
+      </w:r>
+    </w:p>
+    <w:p>
+      <w:pPr>
+        <w:pStyle w:val="a9"/>
+        <w:numPr>
+          <w:ilvl w:val="0"/>
+          <w:numId w:val="10"/>
+        </w:numPr>
+        <w:rPr>
+          <w:i/>
+          <w:iCs/>
+        </w:rPr>
+      </w:pPr>
+      <w:r>
+        <w:rPr>
+          <w:rFonts w:hint="eastAsia"/>
+          <w:i/>
+          <w:iCs/>
+        </w:rPr>
+        <w:t>位置编码：</w:t>
+      </w:r>
+      <w:proofErr w:type="spellStart"/>
+      <w:r>
+        <w:rPr>
+          <w:rFonts w:hint="eastAsia"/>
+          <w:i/>
+          <w:iCs/>
+        </w:rPr>
+        <w:t>YaRN</w:t>
+      </w:r>
+      <w:proofErr w:type="spellEnd"/>
+      <w:r>
+        <w:rPr>
+          <w:rFonts w:hint="eastAsia"/>
+          <w:i/>
+          <w:iCs/>
+        </w:rPr>
+        <w:t xml:space="preserve"> 外推</w:t>
+      </w:r>
+      <w:r>
+        <w:rPr>
+          <w:rFonts w:hint="eastAsia"/>
+          <w:i/>
+          <w:iCs/>
+        </w:rPr>
+        <w:t>（</w:t>
+      </w:r>
+      <w:proofErr w:type="spellStart"/>
+      <w:r>
+        <w:rPr>
+          <w:rFonts w:hint="eastAsia"/>
+          <w:i/>
+          <w:iCs/>
         </w:rPr>
         <w:t>minimind</w:t>
       </w:r>
@@ -1615,113 +2422,63 @@
       <w:r>
         <w:rPr>
           <w:rFonts w:hint="eastAsia"/>
-        </w:rPr>
-        <w:t>模型架构)</w:t>
-      </w:r>
-    </w:p>
-    <w:p>
-      <w:pPr>
-        <w:pStyle w:val="a9"/>
-        <w:ind w:left="792"/>
-        <w:rPr>
-          <w:rFonts w:hint="eastAsia"/>
-        </w:rPr>
-      </w:pPr>
-      <w:proofErr w:type="spellStart"/>
-      <w:r>
-        <w:rPr>
-          <w:rFonts w:hint="eastAsia"/>
-        </w:rPr>
-        <w:t>d_model</w:t>
-      </w:r>
-      <w:proofErr w:type="spellEnd"/>
-      <w:r>
-        <w:rPr>
-          <w:rFonts w:hint="eastAsia"/>
-        </w:rPr>
-        <w:t xml:space="preserve">: 768, </w:t>
-      </w:r>
-      <w:proofErr w:type="spellStart"/>
-      <w:r>
-        <w:rPr>
-          <w:rFonts w:hint="eastAsia"/>
-        </w:rPr>
-        <w:t>num_layers</w:t>
-      </w:r>
-      <w:proofErr w:type="spellEnd"/>
-      <w:r>
-        <w:rPr>
-          <w:rFonts w:hint="eastAsia"/>
-        </w:rPr>
-        <w:t>: 8</w:t>
-      </w:r>
-      <w:r>
-        <w:rPr>
-          <w:rFonts w:hint="eastAsia"/>
-        </w:rPr>
-        <w:t xml:space="preserve">, </w:t>
-      </w:r>
-      <w:proofErr w:type="spellStart"/>
-      <w:r>
-        <w:rPr>
-          <w:rFonts w:hint="eastAsia"/>
-        </w:rPr>
-        <w:t>num_heads</w:t>
-      </w:r>
-      <w:proofErr w:type="spellEnd"/>
-      <w:r>
-        <w:rPr>
-          <w:rFonts w:hint="eastAsia"/>
-        </w:rPr>
-        <w:t xml:space="preserve">: 8, </w:t>
-      </w:r>
-      <w:proofErr w:type="spellStart"/>
-      <w:r>
-        <w:rPr>
-          <w:rFonts w:hint="eastAsia"/>
-        </w:rPr>
-        <w:t>max_lr</w:t>
-      </w:r>
-      <w:proofErr w:type="spellEnd"/>
-      <w:r>
-        <w:rPr>
-          <w:rFonts w:hint="eastAsia"/>
-        </w:rPr>
-        <w:t xml:space="preserve">: 5e-4, </w:t>
-      </w:r>
-      <w:proofErr w:type="spellStart"/>
-      <w:r>
-        <w:rPr>
-          <w:rFonts w:hint="eastAsia"/>
-        </w:rPr>
-        <w:t>batch_size</w:t>
-      </w:r>
-      <w:proofErr w:type="spellEnd"/>
-      <w:r>
-        <w:rPr>
-          <w:rFonts w:hint="eastAsia"/>
-        </w:rPr>
-        <w:t xml:space="preserve">: 64, </w:t>
-      </w:r>
-    </w:p>
-    <w:p>
-      <w:pPr>
-        <w:pStyle w:val="a9"/>
-        <w:ind w:left="432"/>
-        <w:rPr>
-          <w:rFonts w:hint="eastAsia"/>
-        </w:rPr>
-      </w:pPr>
-    </w:p>
-    <w:p>
-      <w:pPr>
-        <w:pStyle w:val="a9"/>
-        <w:ind w:left="432"/>
-        <w:rPr>
-          <w:rFonts w:hint="eastAsia"/>
-        </w:rPr>
-      </w:pPr>
-    </w:p>
+          <w:i/>
+          <w:iCs/>
+        </w:rPr>
+        <w:t>）</w:t>
+      </w:r>
+    </w:p>
+    <w:p>
+      <w:pPr>
+        <w:pStyle w:val="a9"/>
+        <w:numPr>
+          <w:ilvl w:val="0"/>
+          <w:numId w:val="10"/>
+        </w:numPr>
+        <w:rPr>
+          <w:rFonts w:hint="eastAsia"/>
+          <w:i/>
+          <w:iCs/>
+        </w:rPr>
+      </w:pPr>
+      <w:r>
+        <w:rPr>
+          <w:rFonts w:hint="eastAsia"/>
+          <w:i/>
+          <w:iCs/>
+        </w:rPr>
+        <w:t>架构：</w:t>
+      </w:r>
+      <w:proofErr w:type="spellStart"/>
+      <w:r>
+        <w:rPr>
+          <w:rFonts w:hint="eastAsia"/>
+          <w:i/>
+          <w:iCs/>
+        </w:rPr>
+        <w:t>moe</w:t>
+      </w:r>
+      <w:proofErr w:type="spellEnd"/>
+      <w:r>
+        <w:rPr>
+          <w:rFonts w:hint="eastAsia"/>
+          <w:i/>
+          <w:iCs/>
+        </w:rPr>
+        <w:t>，</w:t>
+      </w:r>
+      <w:proofErr w:type="spellStart"/>
+      <w:r>
+        <w:rPr>
+          <w:rFonts w:hint="eastAsia"/>
+          <w:i/>
+          <w:iCs/>
+        </w:rPr>
+        <w:t>AttnRes</w:t>
+      </w:r>
+      <w:proofErr w:type="spellEnd"/>
+    </w:p>
+    <w:p/>
     <w:p>
       <w:pPr>
         <w:rPr>
@@ -2407,6 +3164,118 @@
     </w:lvl>
   </w:abstractNum>
   <w:abstractNum w:abstractNumId="4" w15:restartNumberingAfterBreak="0">
+    <w:nsid w:val="48AB1C15"/>
+    <w:multiLevelType w:val="hybridMultilevel"/>
+    <w:tmpl w:val="F79829F0"/>
+    <w:lvl w:ilvl="0" w:tplc="A6D4854A">
+      <w:numFmt w:val="bullet"/>
+      <w:lvlText w:val="-"/>
+      <w:lvlJc w:val="left"/>
+      <w:pPr>
+        <w:ind w:left="360" w:hanging="360"/>
+      </w:pPr>
+      <w:rPr>
+        <w:rFonts w:ascii="等线" w:eastAsia="等线" w:hAnsi="等线" w:cstheme="minorBidi" w:hint="eastAsia"/>
+      </w:rPr>
+    </w:lvl>
+    <w:lvl w:ilvl="1" w:tplc="04090003" w:tentative="1">
+      <w:start w:val="1"/>
+      <w:numFmt w:val="bullet"/>
+      <w:lvlText w:val=""/>
+      <w:lvlJc w:val="left"/>
+      <w:pPr>
+        <w:ind w:left="880" w:hanging="440"/>
+      </w:pPr>
+      <w:rPr>
+        <w:rFonts w:ascii="Wingdings" w:hAnsi="Wingdings" w:hint="default"/>
+      </w:rPr>
+    </w:lvl>
+    <w:lvl w:ilvl="2" w:tplc="04090005" w:tentative="1">
+      <w:start w:val="1"/>
+      <w:numFmt w:val="bullet"/>
+      <w:lvlText w:val=""/>
+      <w:lvlJc w:val="left"/>
+      <w:pPr>
+        <w:ind w:left="1320" w:hanging="440"/>
+      </w:pPr>
+      <w:rPr>
+        <w:rFonts w:ascii="Wingdings" w:hAnsi="Wingdings" w:hint="default"/>
+      </w:rPr>
+    </w:lvl>
+    <w:lvl w:ilvl="3" w:tplc="04090001" w:tentative="1">
+      <w:start w:val="1"/>
+      <w:numFmt w:val="bullet"/>
+      <w:lvlText w:val=""/>
+      <w:lvlJc w:val="left"/>
+      <w:pPr>
+        <w:ind w:left="1760" w:hanging="440"/>
+      </w:pPr>
+      <w:rPr>
+        <w:rFonts w:ascii="Wingdings" w:hAnsi="Wingdings" w:hint="default"/>
+      </w:rPr>
+    </w:lvl>
+    <w:lvl w:ilvl="4" w:tplc="04090003" w:tentative="1">
+      <w:start w:val="1"/>
+      <w:numFmt w:val="bullet"/>
+      <w:lvlText w:val=""/>
+      <w:lvlJc w:val="left"/>
+      <w:pPr>
+        <w:ind w:left="2200" w:hanging="440"/>
+      </w:pPr>
+      <w:rPr>
+        <w:rFonts w:ascii="Wingdings" w:hAnsi="Wingdings" w:hint="default"/>
+      </w:rPr>
+    </w:lvl>
+    <w:lvl w:ilvl="5" w:tplc="04090005" w:tentative="1">
+      <w:start w:val="1"/>
+      <w:numFmt w:val="bullet"/>
+      <w:lvlText w:val=""/>
+      <w:lvlJc w:val="left"/>
+      <w:pPr>
+        <w:ind w:left="2640" w:hanging="440"/>
+      </w:pPr>
+      <w:rPr>
+        <w:rFonts w:ascii="Wingdings" w:hAnsi="Wingdings" w:hint="default"/>
+      </w:rPr>
+    </w:lvl>
+    <w:lvl w:ilvl="6" w:tplc="04090001" w:tentative="1">
+      <w:start w:val="1"/>
+      <w:numFmt w:val="bullet"/>
+      <w:lvlText w:val=""/>
+      <w:lvlJc w:val="left"/>
+      <w:pPr>
+        <w:ind w:left="3080" w:hanging="440"/>
+      </w:pPr>
+      <w:rPr>
+        <w:rFonts w:ascii="Wingdings" w:hAnsi="Wingdings" w:hint="default"/>
+      </w:rPr>
+    </w:lvl>
+    <w:lvl w:ilvl="7" w:tplc="04090003" w:tentative="1">
+      <w:start w:val="1"/>
+      <w:numFmt w:val="bullet"/>
+      <w:lvlText w:val=""/>
+      <w:lvlJc w:val="left"/>
+      <w:pPr>
+        <w:ind w:left="3520" w:hanging="440"/>
+      </w:pPr>
+      <w:rPr>
+        <w:rFonts w:ascii="Wingdings" w:hAnsi="Wingdings" w:hint="default"/>
+      </w:rPr>
+    </w:lvl>
+    <w:lvl w:ilvl="8" w:tplc="04090005" w:tentative="1">
+      <w:start w:val="1"/>
+      <w:numFmt w:val="bullet"/>
+      <w:lvlText w:val=""/>
+      <w:lvlJc w:val="left"/>
+      <w:pPr>
+        <w:ind w:left="3960" w:hanging="440"/>
+      </w:pPr>
+      <w:rPr>
+        <w:rFonts w:ascii="Wingdings" w:hAnsi="Wingdings" w:hint="default"/>
+      </w:rPr>
+    </w:lvl>
+  </w:abstractNum>
+  <w:abstractNum w:abstractNumId="5" w15:restartNumberingAfterBreak="0">
     <w:nsid w:val="50080136"/>
     <w:multiLevelType w:val="hybridMultilevel"/>
     <w:tmpl w:val="E8E0643E"/>
@@ -2495,7 +3364,7 @@
       </w:pPr>
     </w:lvl>
   </w:abstractNum>
-  <w:abstractNum w:abstractNumId="5" w15:restartNumberingAfterBreak="0">
+  <w:abstractNum w:abstractNumId="6" w15:restartNumberingAfterBreak="0">
     <w:nsid w:val="626E6AE7"/>
     <w:multiLevelType w:val="hybridMultilevel"/>
     <w:tmpl w:val="C33EB996"/>
@@ -2584,7 +3453,7 @@
       </w:pPr>
     </w:lvl>
   </w:abstractNum>
-  <w:abstractNum w:abstractNumId="6" w15:restartNumberingAfterBreak="0">
+  <w:abstractNum w:abstractNumId="7" w15:restartNumberingAfterBreak="0">
     <w:nsid w:val="67F201EF"/>
     <w:multiLevelType w:val="hybridMultilevel"/>
     <w:tmpl w:val="CD8ACD00"/>
@@ -2697,7 +3566,7 @@
       </w:rPr>
     </w:lvl>
   </w:abstractNum>
-  <w:abstractNum w:abstractNumId="7" w15:restartNumberingAfterBreak="0">
+  <w:abstractNum w:abstractNumId="8" w15:restartNumberingAfterBreak="0">
     <w:nsid w:val="7ED45C8A"/>
     <w:multiLevelType w:val="hybridMultilevel"/>
     <w:tmpl w:val="A9046EB2"/>
@@ -2786,7 +3655,7 @@
       </w:pPr>
     </w:lvl>
   </w:abstractNum>
-  <w:abstractNum w:abstractNumId="8" w15:restartNumberingAfterBreak="0">
+  <w:abstractNum w:abstractNumId="9" w15:restartNumberingAfterBreak="0">
     <w:nsid w:val="7F541D23"/>
     <w:multiLevelType w:val="hybridMultilevel"/>
     <w:tmpl w:val="C988DE1C"/>
@@ -2876,10 +3745,10 @@
     </w:lvl>
   </w:abstractNum>
   <w:num w:numId="1" w16cid:durableId="1437872747">
-    <w:abstractNumId w:val="5"/>
+    <w:abstractNumId w:val="6"/>
   </w:num>
   <w:num w:numId="2" w16cid:durableId="1682928553">
-    <w:abstractNumId w:val="8"/>
+    <w:abstractNumId w:val="9"/>
   </w:num>
   <w:num w:numId="3" w16cid:durableId="905072388">
     <w:abstractNumId w:val="1"/>
@@ -2891,15 +3760,18 @@
     <w:abstractNumId w:val="0"/>
   </w:num>
   <w:num w:numId="6" w16cid:durableId="1717125747">
-    <w:abstractNumId w:val="6"/>
+    <w:abstractNumId w:val="7"/>
   </w:num>
   <w:num w:numId="7" w16cid:durableId="1023939492">
     <w:abstractNumId w:val="3"/>
   </w:num>
   <w:num w:numId="8" w16cid:durableId="211960795">
-    <w:abstractNumId w:val="7"/>
+    <w:abstractNumId w:val="8"/>
   </w:num>
   <w:num w:numId="9" w16cid:durableId="1979258890">
+    <w:abstractNumId w:val="5"/>
+  </w:num>
+  <w:num w:numId="10" w16cid:durableId="1350336128">
     <w:abstractNumId w:val="4"/>
   </w:num>
 </w:numbering>
@@ -3332,7 +4204,6 @@
     <w:next w:val="a"/>
     <w:link w:val="20"/>
     <w:uiPriority w:val="9"/>
-    <w:semiHidden/>
     <w:unhideWhenUsed/>
     <w:qFormat/>
     <w:rsid w:val="009C33C4"/>
@@ -3549,7 +4420,6 @@
     <w:basedOn w:val="a0"/>
     <w:link w:val="2"/>
     <w:uiPriority w:val="9"/>
-    <w:semiHidden/>
     <w:rsid w:val="009C33C4"/>
     <w:rPr>
       <w:rFonts w:asciiTheme="majorHAnsi" w:eastAsiaTheme="majorEastAsia" w:hAnsiTheme="majorHAnsi" w:cstheme="majorBidi"/>

</xml_diff>